<commit_message>
Ajustes flash, mayor por concepto, EFE financiero y conciliaciones, filtros por empresa en requis de sala, de compras, OC, COM, movimientos de stock
</commit_message>
<xml_diff>
--- a/docs/manual-solicitudpago/Manual_Usuario_AnitaERP_Solicitudes_Pago.docx
+++ b/docs/manual-solicitudpago/Manual_Usuario_AnitaERP_Solicitudes_Pago.docx
@@ -60,7 +60,7 @@
           <w:sz w:val="22"/>
           <w:szCs w:val="22"/>
         </w:rPr>
-        <w:t xml:space="preserve">Versión 1.0 — julio 2026</w:t>
+        <w:t xml:space="preserve">Versión 1.1 — julio 2026</w:t>
       </w:r>
     </w:p>
     <w:p/>
@@ -139,7 +139,7 @@
           <w:sz w:val="22"/>
           <w:szCs w:val="22"/>
         </w:rPr>
-        <w:t xml:space="preserve">5. Filtros del listado (detalle)</w:t>
+        <w:t xml:space="preserve">5. Carga masiva desde CSV</w:t>
       </w:r>
     </w:p>
     <w:p>
@@ -149,7 +149,7 @@
           <w:sz w:val="22"/>
           <w:szCs w:val="22"/>
         </w:rPr>
-        <w:t xml:space="preserve">6. Consulta de madres, hijas y cuotas</w:t>
+        <w:t xml:space="preserve">6. Filtros del listado (detalle)</w:t>
       </w:r>
     </w:p>
     <w:p>
@@ -159,7 +159,7 @@
           <w:sz w:val="22"/>
           <w:szCs w:val="22"/>
         </w:rPr>
-        <w:t xml:space="preserve">7. Alta y edición de una SP</w:t>
+        <w:t xml:space="preserve">7. Consulta de madres, hijas y cuotas</w:t>
       </w:r>
     </w:p>
     <w:p>
@@ -169,7 +169,7 @@
           <w:sz w:val="22"/>
           <w:szCs w:val="22"/>
         </w:rPr>
-        <w:t xml:space="preserve">8. Plan de cuotas (madre)</w:t>
+        <w:t xml:space="preserve">8. Alta y edición de una SP</w:t>
       </w:r>
     </w:p>
     <w:p>
@@ -179,7 +179,7 @@
           <w:sz w:val="22"/>
           <w:szCs w:val="22"/>
         </w:rPr>
-        <w:t xml:space="preserve">9. Informe de solicitudes de pago</w:t>
+        <w:t xml:space="preserve">9. Plan de cuotas (madre)</w:t>
       </w:r>
     </w:p>
     <w:p>
@@ -189,7 +189,7 @@
           <w:sz w:val="22"/>
           <w:szCs w:val="22"/>
         </w:rPr>
-        <w:t xml:space="preserve">10. Permisos</w:t>
+        <w:t xml:space="preserve">10. Informe de solicitudes de pago</w:t>
       </w:r>
     </w:p>
     <w:p>
@@ -199,7 +199,17 @@
           <w:sz w:val="22"/>
           <w:szCs w:val="22"/>
         </w:rPr>
-        <w:t xml:space="preserve">11. Buenas prácticas</w:t>
+        <w:t xml:space="preserve">11. Permisos</w:t>
+      </w:r>
+    </w:p>
+    <w:p>
+      <w:pPr/>
+      <w:r>
+        <w:rPr>
+          <w:sz w:val="22"/>
+          <w:szCs w:val="22"/>
+        </w:rPr>
+        <w:t xml:space="preserve">12. Buenas prácticas</w:t>
       </w:r>
     </w:p>
     <w:p>
@@ -227,7 +237,7 @@
           <w:sz w:val="22"/>
           <w:szCs w:val="22"/>
         </w:rPr>
-        <w:t xml:space="preserve">Este manual explica el circuito de Solicitudes de pago (SP) en Anita ERP: cómo listar, filtrar, cargar, autorizar, pagar y consultar planes con cuotas (madre e hijas). Está pensado para quien usa el sistema en el día a día; no hace falta saber programación.</w:t>
+        <w:t xml:space="preserve">Este manual explica el circuito de Solicitudes de pago (SP) en Anita ERP: cómo listar, filtrar, cargar (una a una o por CSV masivo), autorizar, pagar y consultar planes con cuotas (madre e hijas). Está pensado para quien usa el sistema en el día a día; no hace falta saber programación.</w:t>
       </w:r>
     </w:p>
     <w:p>
@@ -266,7 +276,7 @@
           <w:sz w:val="22"/>
           <w:szCs w:val="22"/>
         </w:rPr>
-        <w:t xml:space="preserve">Desde el Centro de ayuda o el botón Manual del listado puede volver a este documento en cualquier momento.</w:t>
+        <w:t xml:space="preserve">La documentación oficial está en el Centro de ayuda del ERP. Ahí encontrará este manual y el resto de guías de módulo. El asistente de IA (panel FAB) también puede citar extractos de este manual cuando pregunta cómo operar una SP.</w:t>
       </w:r>
     </w:p>
     <w:p>
@@ -303,6 +313,18 @@
       <w:r>
         <w:rPr/>
         <w:t xml:space="preserve">Desde el ícono de plan/cuotas puede consultar madre e hijas sin perder el listado.</w:t>
+      </w:r>
+    </w:p>
+    <w:p>
+      <w:pPr>
+        <w:numPr>
+          <w:ilvl w:val="0"/>
+          <w:numId w:val=""/>
+        </w:numPr>
+      </w:pPr>
+      <w:r>
+        <w:rPr/>
+        <w:t xml:space="preserve">Carga masiva CSV: botón en el listado (permiso crear) para incorporar muchas SP de una vez, con vista previa.</w:t>
       </w:r>
     </w:p>
     <w:p/>
@@ -758,6 +780,41 @@
           </w:p>
         </w:tc>
       </w:tr>
+      <w:tr>
+        <w:trPr/>
+        <w:tc>
+          <w:tcPr>
+            <w:tcW w:w="2800" w:type="dxa"/>
+            <w:noWrap/>
+          </w:tcPr>
+          <w:p>
+            <w:pPr/>
+            <w:r>
+              <w:rPr>
+                <w:sz w:val="20"/>
+                <w:szCs w:val="20"/>
+              </w:rPr>
+              <w:t xml:space="preserve">Carga masiva</w:t>
+            </w:r>
+          </w:p>
+        </w:tc>
+        <w:tc>
+          <w:tcPr>
+            <w:tcW w:w="2800" w:type="dxa"/>
+            <w:noWrap/>
+          </w:tcPr>
+          <w:p>
+            <w:pPr/>
+            <w:r>
+              <w:rPr>
+                <w:sz w:val="20"/>
+                <w:szCs w:val="20"/>
+              </w:rPr>
+              <w:t xml:space="preserve">Alta de muchas SP desde un CSV (formato Anita p-cargasolpm), con preview y confirmación.</w:t>
+            </w:r>
+          </w:p>
+        </w:tc>
+      </w:tr>
     </w:tbl>
     <w:p/>
     <w:p>
@@ -844,6 +901,19 @@
           <w:szCs w:val="22"/>
         </w:rPr>
         <w:t xml:space="preserve">Si necesita rearmar notificaciones del árbol (sin estar Pagada), use Reenviar al árbol o Reenviar correo en la edición de la SP.</w:t>
+      </w:r>
+    </w:p>
+    <w:p>
+      <w:pPr>
+        <w:jc w:val="both"/>
+        <w:spacing w:after="120"/>
+      </w:pPr>
+      <w:r>
+        <w:rPr>
+          <w:sz w:val="22"/>
+          <w:szCs w:val="22"/>
+        </w:rPr>
+        <w:t xml:space="preserve">Las SP creadas por carga masiva CSV nacen Autorizadas (igual que en Anita): no disparan el árbol al crear. Sirven para liquidaciones y lotes ya revisados fuera del ERP.</w:t>
       </w:r>
     </w:p>
     <w:p>
@@ -1025,7 +1095,7 @@
                 <w:sz w:val="20"/>
                 <w:szCs w:val="20"/>
               </w:rPr>
-              <w:t xml:space="preserve">Lista para pagar (IE) o marcar pagada.</w:t>
+              <w:t xml:space="preserve">Lista para pagar (IE) o marcar pagada. También estado de salida de la carga masiva CSV.</w:t>
             </w:r>
           </w:p>
         </w:tc>
@@ -1294,6 +1364,19 @@
     </w:p>
     <w:p>
       <w:pPr>
+        <w:jc w:val="both"/>
+        <w:spacing w:after="120"/>
+      </w:pPr>
+      <w:r>
+        <w:rPr>
+          <w:sz w:val="22"/>
+          <w:szCs w:val="22"/>
+        </w:rPr>
+        <w:t xml:space="preserve">Documentación: use el Centro de ayuda del ERP (no hay botón Manual en el listado).</w:t>
+      </w:r>
+    </w:p>
+    <w:p>
+      <w:pPr>
         <w:numPr>
           <w:ilvl w:val="0"/>
           <w:numId w:val=""/>
@@ -1349,7 +1432,7 @@
       </w:pPr>
       <w:r>
         <w:rPr/>
-        <w:t xml:space="preserve">Manual: abre esta guía en otra pestaña.</w:t>
+        <w:t xml:space="preserve">Carga masiva: importa un CSV Anita, muestra preview y genera las SP.</w:t>
       </w:r>
     </w:p>
     <w:p/>
@@ -1488,39 +1571,39 @@
                 <w:sz w:val="20"/>
                 <w:szCs w:val="20"/>
               </w:rPr>
-              <w:t xml:space="preserve">Manual / Guía del módulo</w:t>
-            </w:r>
-          </w:p>
-        </w:tc>
-        <w:tc>
-          <w:tcPr>
-            <w:tcW w:w="2800" w:type="dxa"/>
-            <w:noWrap/>
-          </w:tcPr>
-          <w:p>
-            <w:pPr/>
-            <w:r>
-              <w:rPr>
-                <w:sz w:val="20"/>
-                <w:szCs w:val="20"/>
-              </w:rPr>
-              <w:t xml:space="preserve">Esquina superior derecha del listado (ícono libro)</w:t>
-            </w:r>
-          </w:p>
-        </w:tc>
-        <w:tc>
-          <w:tcPr>
-            <w:tcW w:w="2800" w:type="dxa"/>
-            <w:noWrap/>
-          </w:tcPr>
-          <w:p>
-            <w:pPr/>
-            <w:r>
-              <w:rPr>
-                <w:sz w:val="20"/>
-                <w:szCs w:val="20"/>
-              </w:rPr>
-              <w:t xml:space="preserve">Abre este manual de usuario en una pestaña nueva.</w:t>
+              <w:t xml:space="preserve">Centro de ayuda</w:t>
+            </w:r>
+          </w:p>
+        </w:tc>
+        <w:tc>
+          <w:tcPr>
+            <w:tcW w:w="2800" w:type="dxa"/>
+            <w:noWrap/>
+          </w:tcPr>
+          <w:p>
+            <w:pPr/>
+            <w:r>
+              <w:rPr>
+                <w:sz w:val="20"/>
+                <w:szCs w:val="20"/>
+              </w:rPr>
+              <w:t xml:space="preserve">Menú de ayuda del ERP (no en el listado de SP)</w:t>
+            </w:r>
+          </w:p>
+        </w:tc>
+        <w:tc>
+          <w:tcPr>
+            <w:tcW w:w="2800" w:type="dxa"/>
+            <w:noWrap/>
+          </w:tcPr>
+          <w:p>
+            <w:pPr/>
+            <w:r>
+              <w:rPr>
+                <w:sz w:val="20"/>
+                <w:szCs w:val="20"/>
+              </w:rPr>
+              <w:t xml:space="preserve">Abre el catálogo de manuales; elija Solicitudes de pago.</w:t>
             </w:r>
           </w:p>
         </w:tc>
@@ -1588,6 +1671,73 @@
                 <w:szCs w:val="20"/>
               </w:rPr>
               <w:t xml:space="preserve">Abre el formulario de alta de una solicitud de pago.</w:t>
+            </w:r>
+          </w:p>
+        </w:tc>
+        <w:tc>
+          <w:tcPr>
+            <w:tcW w:w="2800" w:type="dxa"/>
+            <w:noWrap/>
+          </w:tcPr>
+          <w:p>
+            <w:pPr/>
+            <w:r>
+              <w:rPr>
+                <w:sz w:val="20"/>
+                <w:szCs w:val="20"/>
+              </w:rPr>
+              <w:t xml:space="preserve">crear-solicitud-pago</w:t>
+            </w:r>
+          </w:p>
+        </w:tc>
+      </w:tr>
+      <w:tr>
+        <w:trPr/>
+        <w:tc>
+          <w:tcPr>
+            <w:tcW w:w="2800" w:type="dxa"/>
+            <w:noWrap/>
+          </w:tcPr>
+          <w:p>
+            <w:pPr/>
+            <w:r>
+              <w:rPr>
+                <w:sz w:val="20"/>
+                <w:szCs w:val="20"/>
+              </w:rPr>
+              <w:t xml:space="preserve">Carga masiva</w:t>
+            </w:r>
+          </w:p>
+        </w:tc>
+        <w:tc>
+          <w:tcPr>
+            <w:tcW w:w="2800" w:type="dxa"/>
+            <w:noWrap/>
+          </w:tcPr>
+          <w:p>
+            <w:pPr/>
+            <w:r>
+              <w:rPr>
+                <w:sz w:val="20"/>
+                <w:szCs w:val="20"/>
+              </w:rPr>
+              <w:t xml:space="preserve">Barra superior de la tarjeta (card-header) — botón verde</w:t>
+            </w:r>
+          </w:p>
+        </w:tc>
+        <w:tc>
+          <w:tcPr>
+            <w:tcW w:w="2800" w:type="dxa"/>
+            <w:noWrap/>
+          </w:tcPr>
+          <w:p>
+            <w:pPr/>
+            <w:r>
+              <w:rPr>
+                <w:sz w:val="20"/>
+                <w:szCs w:val="20"/>
+              </w:rPr>
+              <w:t xml:space="preserve">Sube CSV Anita, muestra preview (cantidad, montos, errores) y genera SP Autorizadas.</w:t>
             </w:r>
           </w:p>
         </w:tc>
@@ -2286,9 +2436,783 @@
       </w:pPr>
       <w:bookmarkStart w:id="5" w:name="_Toc5"/>
       <w:r>
-        <w:t>5. Filtros del listado (detalle)</w:t>
+        <w:t>5. Carga masiva desde CSV</w:t>
       </w:r>
       <w:bookmarkEnd w:id="5"/>
+    </w:p>
+    <w:p>
+      <w:pPr>
+        <w:jc w:val="both"/>
+        <w:spacing w:after="120"/>
+      </w:pPr>
+      <w:r>
+        <w:rPr>
+          <w:sz w:val="22"/>
+          <w:szCs w:val="22"/>
+        </w:rPr>
+        <w:t xml:space="preserve">En el listado, el botón Carga masiva (permiso crear-solicitud-pago) abre un modal para incorporar muchas solicitudes de una vez, con el mismo formato que Anita (proceso p-cargasolpm).</w:t>
+      </w:r>
+    </w:p>
+    <w:p>
+      <w:pPr>
+        <w:jc w:val="both"/>
+        <w:spacing w:after="120"/>
+      </w:pPr>
+      <w:r>
+        <w:rPr>
+          <w:sz w:val="22"/>
+          <w:szCs w:val="22"/>
+        </w:rPr>
+        <w:t xml:space="preserve">Paso 1 — Archivo: suba un CSV (coma o punto y coma). La primera fila de encabezado se ignora automáticamente. Máximo 1000 filas de datos.</w:t>
+      </w:r>
+    </w:p>
+    <w:p>
+      <w:pPr>
+        <w:jc w:val="both"/>
+        <w:spacing w:after="120"/>
+      </w:pPr>
+      <w:r>
+        <w:rPr>
+          <w:sz w:val="22"/>
+          <w:szCs w:val="22"/>
+        </w:rPr>
+        <w:t xml:space="preserve">Paso 2 — Vista previa: el sistema valida empresa, proveedor, concepto, sector, forma de pago, moneda y cuentas contables (por empresa). Muestra cuántas SP se generarán, monto total, totales por empresa, códigos estimados y el detalle fila a fila (OK o error).</w:t>
+      </w:r>
+    </w:p>
+    <w:p>
+      <w:pPr>
+        <w:jc w:val="both"/>
+        <w:spacing w:after="120"/>
+      </w:pPr>
+      <w:r>
+        <w:rPr>
+          <w:sz w:val="22"/>
+          <w:szCs w:val="22"/>
+        </w:rPr>
+        <w:t xml:space="preserve">Paso 3 — Confirmar: pulse Generar N solicitudes. Cada fila válida se graba como SP Autorizada, tratamiento Normal, fecha de entrega = hoy, sin plan de cuotas ni archivos. Al terminar verá el rango de códigos creados y links a las primeras SP.</w:t>
+      </w:r>
+    </w:p>
+    <w:p>
+      <w:pPr/>
+      <w:r>
+        <w:rPr>
+          <w:color w:val="666666"/>
+          <w:sz w:val="18"/>
+          <w:szCs w:val="18"/>
+          <w:i w:val="1"/>
+          <w:iCs w:val="1"/>
+        </w:rPr>
+        <w:t xml:space="preserve">Columnas del CSV (orden fijo Anita)</w:t>
+      </w:r>
+    </w:p>
+    <w:tbl>
+      <w:tblGrid>
+        <w:gridCol w:w="2800" w:type="dxa"/>
+        <w:gridCol w:w="2800" w:type="dxa"/>
+        <w:gridCol w:w="2800" w:type="dxa"/>
+      </w:tblGrid>
+      <w:tblPr>
+        <w:tblW w:w="0" w:type="auto"/>
+        <w:tblLayout w:type="autofit"/>
+        <w:tblCellMar>
+          <w:top w:w="80" w:type="dxa"/>
+          <w:left w:w="80" w:type="dxa"/>
+          <w:right w:w="80" w:type="dxa"/>
+          <w:bottom w:w="80" w:type="dxa"/>
+        </w:tblCellMar>
+        <w:tblBorders>
+          <w:top w:val="single" w:sz="6" w:color="AAAAAA"/>
+          <w:left w:val="single" w:sz="6" w:color="AAAAAA"/>
+          <w:right w:val="single" w:sz="6" w:color="AAAAAA"/>
+          <w:bottom w:val="single" w:sz="6" w:color="AAAAAA"/>
+          <w:insideH w:val="single" w:sz="6" w:color="AAAAAA"/>
+          <w:insideV w:val="single" w:sz="6" w:color="AAAAAA"/>
+        </w:tblBorders>
+      </w:tblPr>
+      <w:tr>
+        <w:trPr/>
+        <w:tc>
+          <w:tcPr>
+            <w:tcW w:w="2800" w:type="dxa"/>
+            <w:shd w:val="clear" w:fill="2E75B6"/>
+            <w:noWrap/>
+          </w:tcPr>
+          <w:p>
+            <w:pPr/>
+            <w:r>
+              <w:rPr>
+                <w:color w:val="FFFFFF"/>
+                <w:sz w:val="20"/>
+                <w:szCs w:val="20"/>
+                <w:b w:val="1"/>
+                <w:bCs w:val="1"/>
+              </w:rPr>
+              <w:t xml:space="preserve">Col</w:t>
+            </w:r>
+          </w:p>
+        </w:tc>
+        <w:tc>
+          <w:tcPr>
+            <w:tcW w:w="2800" w:type="dxa"/>
+            <w:shd w:val="clear" w:fill="2E75B6"/>
+            <w:noWrap/>
+          </w:tcPr>
+          <w:p>
+            <w:pPr/>
+            <w:r>
+              <w:rPr>
+                <w:color w:val="FFFFFF"/>
+                <w:sz w:val="20"/>
+                <w:szCs w:val="20"/>
+                <w:b w:val="1"/>
+                <w:bCs w:val="1"/>
+              </w:rPr>
+              <w:t xml:space="preserve">Campo</w:t>
+            </w:r>
+          </w:p>
+        </w:tc>
+        <w:tc>
+          <w:tcPr>
+            <w:tcW w:w="2800" w:type="dxa"/>
+            <w:shd w:val="clear" w:fill="2E75B6"/>
+            <w:noWrap/>
+          </w:tcPr>
+          <w:p>
+            <w:pPr/>
+            <w:r>
+              <w:rPr>
+                <w:color w:val="FFFFFF"/>
+                <w:sz w:val="20"/>
+                <w:szCs w:val="20"/>
+                <w:b w:val="1"/>
+                <w:bCs w:val="1"/>
+              </w:rPr>
+              <w:t xml:space="preserve">Notas</w:t>
+            </w:r>
+          </w:p>
+        </w:tc>
+      </w:tr>
+      <w:tr>
+        <w:trPr/>
+        <w:tc>
+          <w:tcPr>
+            <w:tcW w:w="2800" w:type="dxa"/>
+            <w:noWrap/>
+          </w:tcPr>
+          <w:p>
+            <w:pPr/>
+            <w:r>
+              <w:rPr>
+                <w:sz w:val="20"/>
+                <w:szCs w:val="20"/>
+              </w:rPr>
+              <w:t xml:space="preserve">1</w:t>
+            </w:r>
+          </w:p>
+        </w:tc>
+        <w:tc>
+          <w:tcPr>
+            <w:tcW w:w="2800" w:type="dxa"/>
+            <w:noWrap/>
+          </w:tcPr>
+          <w:p>
+            <w:pPr/>
+            <w:r>
+              <w:rPr>
+                <w:sz w:val="20"/>
+                <w:szCs w:val="20"/>
+              </w:rPr>
+              <w:t xml:space="preserve">Empresa</w:t>
+            </w:r>
+          </w:p>
+        </w:tc>
+        <w:tc>
+          <w:tcPr>
+            <w:tcW w:w="2800" w:type="dxa"/>
+            <w:noWrap/>
+          </w:tcPr>
+          <w:p>
+            <w:pPr/>
+            <w:r>
+              <w:rPr>
+                <w:sz w:val="20"/>
+                <w:szCs w:val="20"/>
+              </w:rPr>
+              <w:t xml:space="preserve">Código Anita de empresa (ej. 1, 2, 3).</w:t>
+            </w:r>
+          </w:p>
+        </w:tc>
+      </w:tr>
+      <w:tr>
+        <w:trPr/>
+        <w:tc>
+          <w:tcPr>
+            <w:tcW w:w="2800" w:type="dxa"/>
+            <w:noWrap/>
+          </w:tcPr>
+          <w:p>
+            <w:pPr/>
+            <w:r>
+              <w:rPr>
+                <w:sz w:val="20"/>
+                <w:szCs w:val="20"/>
+              </w:rPr>
+              <w:t xml:space="preserve">2</w:t>
+            </w:r>
+          </w:p>
+        </w:tc>
+        <w:tc>
+          <w:tcPr>
+            <w:tcW w:w="2800" w:type="dxa"/>
+            <w:noWrap/>
+          </w:tcPr>
+          <w:p>
+            <w:pPr/>
+            <w:r>
+              <w:rPr>
+                <w:sz w:val="20"/>
+                <w:szCs w:val="20"/>
+              </w:rPr>
+              <w:t xml:space="preserve">Proveedor</w:t>
+            </w:r>
+          </w:p>
+        </w:tc>
+        <w:tc>
+          <w:tcPr>
+            <w:tcW w:w="2800" w:type="dxa"/>
+            <w:noWrap/>
+          </w:tcPr>
+          <w:p>
+            <w:pPr/>
+            <w:r>
+              <w:rPr>
+                <w:sz w:val="20"/>
+                <w:szCs w:val="20"/>
+              </w:rPr>
+              <w:t xml:space="preserve">Código de proveedor (se completa a 6 dígitos).</w:t>
+            </w:r>
+          </w:p>
+        </w:tc>
+      </w:tr>
+      <w:tr>
+        <w:trPr/>
+        <w:tc>
+          <w:tcPr>
+            <w:tcW w:w="2800" w:type="dxa"/>
+            <w:noWrap/>
+          </w:tcPr>
+          <w:p>
+            <w:pPr/>
+            <w:r>
+              <w:rPr>
+                <w:sz w:val="20"/>
+                <w:szCs w:val="20"/>
+              </w:rPr>
+              <w:t xml:space="preserve">3</w:t>
+            </w:r>
+          </w:p>
+        </w:tc>
+        <w:tc>
+          <w:tcPr>
+            <w:tcW w:w="2800" w:type="dxa"/>
+            <w:noWrap/>
+          </w:tcPr>
+          <w:p>
+            <w:pPr/>
+            <w:r>
+              <w:rPr>
+                <w:sz w:val="20"/>
+                <w:szCs w:val="20"/>
+              </w:rPr>
+              <w:t xml:space="preserve">Concepto</w:t>
+            </w:r>
+          </w:p>
+        </w:tc>
+        <w:tc>
+          <w:tcPr>
+            <w:tcW w:w="2800" w:type="dxa"/>
+            <w:noWrap/>
+          </w:tcPr>
+          <w:p>
+            <w:pPr/>
+            <w:r>
+              <w:rPr>
+                <w:sz w:val="20"/>
+                <w:szCs w:val="20"/>
+              </w:rPr>
+              <w:t xml:space="preserve">Código de concepto de solicitud de pago.</w:t>
+            </w:r>
+          </w:p>
+        </w:tc>
+      </w:tr>
+      <w:tr>
+        <w:trPr/>
+        <w:tc>
+          <w:tcPr>
+            <w:tcW w:w="2800" w:type="dxa"/>
+            <w:noWrap/>
+          </w:tcPr>
+          <w:p>
+            <w:pPr/>
+            <w:r>
+              <w:rPr>
+                <w:sz w:val="20"/>
+                <w:szCs w:val="20"/>
+              </w:rPr>
+              <w:t xml:space="preserve">4</w:t>
+            </w:r>
+          </w:p>
+        </w:tc>
+        <w:tc>
+          <w:tcPr>
+            <w:tcW w:w="2800" w:type="dxa"/>
+            <w:noWrap/>
+          </w:tcPr>
+          <w:p>
+            <w:pPr/>
+            <w:r>
+              <w:rPr>
+                <w:sz w:val="20"/>
+                <w:szCs w:val="20"/>
+              </w:rPr>
+              <w:t xml:space="preserve">Sector</w:t>
+            </w:r>
+          </w:p>
+        </w:tc>
+        <w:tc>
+          <w:tcPr>
+            <w:tcW w:w="2800" w:type="dxa"/>
+            <w:noWrap/>
+          </w:tcPr>
+          <w:p>
+            <w:pPr/>
+            <w:r>
+              <w:rPr>
+                <w:sz w:val="20"/>
+                <w:szCs w:val="20"/>
+              </w:rPr>
+              <w:t xml:space="preserve">Código de sector SP (también aporta el centro de costo de línea).</w:t>
+            </w:r>
+          </w:p>
+        </w:tc>
+      </w:tr>
+      <w:tr>
+        <w:trPr/>
+        <w:tc>
+          <w:tcPr>
+            <w:tcW w:w="2800" w:type="dxa"/>
+            <w:noWrap/>
+          </w:tcPr>
+          <w:p>
+            <w:pPr/>
+            <w:r>
+              <w:rPr>
+                <w:sz w:val="20"/>
+                <w:szCs w:val="20"/>
+              </w:rPr>
+              <w:t xml:space="preserve">5</w:t>
+            </w:r>
+          </w:p>
+        </w:tc>
+        <w:tc>
+          <w:tcPr>
+            <w:tcW w:w="2800" w:type="dxa"/>
+            <w:noWrap/>
+          </w:tcPr>
+          <w:p>
+            <w:pPr/>
+            <w:r>
+              <w:rPr>
+                <w:sz w:val="20"/>
+                <w:szCs w:val="20"/>
+              </w:rPr>
+              <w:t xml:space="preserve">Forma de pago</w:t>
+            </w:r>
+          </w:p>
+        </w:tc>
+        <w:tc>
+          <w:tcPr>
+            <w:tcW w:w="2800" w:type="dxa"/>
+            <w:noWrap/>
+          </w:tcPr>
+          <w:p>
+            <w:pPr/>
+            <w:r>
+              <w:rPr>
+                <w:sz w:val="20"/>
+                <w:szCs w:val="20"/>
+              </w:rPr>
+              <w:t xml:space="preserve">Código de forma de pago SP.</w:t>
+            </w:r>
+          </w:p>
+        </w:tc>
+      </w:tr>
+      <w:tr>
+        <w:trPr/>
+        <w:tc>
+          <w:tcPr>
+            <w:tcW w:w="2800" w:type="dxa"/>
+            <w:noWrap/>
+          </w:tcPr>
+          <w:p>
+            <w:pPr/>
+            <w:r>
+              <w:rPr>
+                <w:sz w:val="20"/>
+                <w:szCs w:val="20"/>
+              </w:rPr>
+              <w:t xml:space="preserve">6</w:t>
+            </w:r>
+          </w:p>
+        </w:tc>
+        <w:tc>
+          <w:tcPr>
+            <w:tcW w:w="2800" w:type="dxa"/>
+            <w:noWrap/>
+          </w:tcPr>
+          <w:p>
+            <w:pPr/>
+            <w:r>
+              <w:rPr>
+                <w:sz w:val="20"/>
+                <w:szCs w:val="20"/>
+              </w:rPr>
+              <w:t xml:space="preserve">Beneficiario</w:t>
+            </w:r>
+          </w:p>
+        </w:tc>
+        <w:tc>
+          <w:tcPr>
+            <w:tcW w:w="2800" w:type="dxa"/>
+            <w:noWrap/>
+          </w:tcPr>
+          <w:p>
+            <w:pPr/>
+            <w:r>
+              <w:rPr>
+                <w:sz w:val="20"/>
+                <w:szCs w:val="20"/>
+              </w:rPr>
+              <w:t xml:space="preserve">Texto opcional.</w:t>
+            </w:r>
+          </w:p>
+        </w:tc>
+      </w:tr>
+      <w:tr>
+        <w:trPr/>
+        <w:tc>
+          <w:tcPr>
+            <w:tcW w:w="2800" w:type="dxa"/>
+            <w:noWrap/>
+          </w:tcPr>
+          <w:p>
+            <w:pPr/>
+            <w:r>
+              <w:rPr>
+                <w:sz w:val="20"/>
+                <w:szCs w:val="20"/>
+              </w:rPr>
+              <w:t xml:space="preserve">7</w:t>
+            </w:r>
+          </w:p>
+        </w:tc>
+        <w:tc>
+          <w:tcPr>
+            <w:tcW w:w="2800" w:type="dxa"/>
+            <w:noWrap/>
+          </w:tcPr>
+          <w:p>
+            <w:pPr/>
+            <w:r>
+              <w:rPr>
+                <w:sz w:val="20"/>
+                <w:szCs w:val="20"/>
+              </w:rPr>
+              <w:t xml:space="preserve">Moneda</w:t>
+            </w:r>
+          </w:p>
+        </w:tc>
+        <w:tc>
+          <w:tcPr>
+            <w:tcW w:w="2800" w:type="dxa"/>
+            <w:noWrap/>
+          </w:tcPr>
+          <w:p>
+            <w:pPr/>
+            <w:r>
+              <w:rPr>
+                <w:sz w:val="20"/>
+                <w:szCs w:val="20"/>
+              </w:rPr>
+              <w:t xml:space="preserve">Código moneda Anita (ej. 1 = pesos).</w:t>
+            </w:r>
+          </w:p>
+        </w:tc>
+      </w:tr>
+      <w:tr>
+        <w:trPr/>
+        <w:tc>
+          <w:tcPr>
+            <w:tcW w:w="2800" w:type="dxa"/>
+            <w:noWrap/>
+          </w:tcPr>
+          <w:p>
+            <w:pPr/>
+            <w:r>
+              <w:rPr>
+                <w:sz w:val="20"/>
+                <w:szCs w:val="20"/>
+              </w:rPr>
+              <w:t xml:space="preserve">8</w:t>
+            </w:r>
+          </w:p>
+        </w:tc>
+        <w:tc>
+          <w:tcPr>
+            <w:tcW w:w="2800" w:type="dxa"/>
+            <w:noWrap/>
+          </w:tcPr>
+          <w:p>
+            <w:pPr/>
+            <w:r>
+              <w:rPr>
+                <w:sz w:val="20"/>
+                <w:szCs w:val="20"/>
+              </w:rPr>
+              <w:t xml:space="preserve">Detalle</w:t>
+            </w:r>
+          </w:p>
+        </w:tc>
+        <w:tc>
+          <w:tcPr>
+            <w:tcW w:w="2800" w:type="dxa"/>
+            <w:noWrap/>
+          </w:tcPr>
+          <w:p>
+            <w:pPr/>
+            <w:r>
+              <w:rPr>
+                <w:sz w:val="20"/>
+                <w:szCs w:val="20"/>
+              </w:rPr>
+              <w:t xml:space="preserve">Texto descriptivo (máx. 180).</w:t>
+            </w:r>
+          </w:p>
+        </w:tc>
+      </w:tr>
+      <w:tr>
+        <w:trPr/>
+        <w:tc>
+          <w:tcPr>
+            <w:tcW w:w="2800" w:type="dxa"/>
+            <w:noWrap/>
+          </w:tcPr>
+          <w:p>
+            <w:pPr/>
+            <w:r>
+              <w:rPr>
+                <w:sz w:val="20"/>
+                <w:szCs w:val="20"/>
+              </w:rPr>
+              <w:t xml:space="preserve">9</w:t>
+            </w:r>
+          </w:p>
+        </w:tc>
+        <w:tc>
+          <w:tcPr>
+            <w:tcW w:w="2800" w:type="dxa"/>
+            <w:noWrap/>
+          </w:tcPr>
+          <w:p>
+            <w:pPr/>
+            <w:r>
+              <w:rPr>
+                <w:sz w:val="20"/>
+                <w:szCs w:val="20"/>
+              </w:rPr>
+              <w:t xml:space="preserve">Fecha vencimiento</w:t>
+            </w:r>
+          </w:p>
+        </w:tc>
+        <w:tc>
+          <w:tcPr>
+            <w:tcW w:w="2800" w:type="dxa"/>
+            <w:noWrap/>
+          </w:tcPr>
+          <w:p>
+            <w:pPr/>
+            <w:r>
+              <w:rPr>
+                <w:sz w:val="20"/>
+                <w:szCs w:val="20"/>
+              </w:rPr>
+              <w:t xml:space="preserve">dd/mm/aaaa; vacío = sin vencimiento.</w:t>
+            </w:r>
+          </w:p>
+        </w:tc>
+      </w:tr>
+      <w:tr>
+        <w:trPr/>
+        <w:tc>
+          <w:tcPr>
+            <w:tcW w:w="2800" w:type="dxa"/>
+            <w:noWrap/>
+          </w:tcPr>
+          <w:p>
+            <w:pPr/>
+            <w:r>
+              <w:rPr>
+                <w:sz w:val="20"/>
+                <w:szCs w:val="20"/>
+              </w:rPr>
+              <w:t xml:space="preserve">10</w:t>
+            </w:r>
+          </w:p>
+        </w:tc>
+        <w:tc>
+          <w:tcPr>
+            <w:tcW w:w="2800" w:type="dxa"/>
+            <w:noWrap/>
+          </w:tcPr>
+          <w:p>
+            <w:pPr/>
+            <w:r>
+              <w:rPr>
+                <w:sz w:val="20"/>
+                <w:szCs w:val="20"/>
+              </w:rPr>
+              <w:t xml:space="preserve">Monto total</w:t>
+            </w:r>
+          </w:p>
+        </w:tc>
+        <w:tc>
+          <w:tcPr>
+            <w:tcW w:w="2800" w:type="dxa"/>
+            <w:noWrap/>
+          </w:tcPr>
+          <w:p>
+            <w:pPr/>
+            <w:r>
+              <w:rPr>
+                <w:sz w:val="20"/>
+                <w:szCs w:val="20"/>
+              </w:rPr>
+              <w:t xml:space="preserve">Importe del pago (sin espacios; se limpian comas de miles).</w:t>
+            </w:r>
+          </w:p>
+        </w:tc>
+      </w:tr>
+      <w:tr>
+        <w:trPr/>
+        <w:tc>
+          <w:tcPr>
+            <w:tcW w:w="2800" w:type="dxa"/>
+            <w:noWrap/>
+          </w:tcPr>
+          <w:p>
+            <w:pPr/>
+            <w:r>
+              <w:rPr>
+                <w:sz w:val="20"/>
+                <w:szCs w:val="20"/>
+              </w:rPr>
+              <w:t xml:space="preserve">11+</w:t>
+            </w:r>
+          </w:p>
+        </w:tc>
+        <w:tc>
+          <w:tcPr>
+            <w:tcW w:w="2800" w:type="dxa"/>
+            <w:noWrap/>
+          </w:tcPr>
+          <w:p>
+            <w:pPr/>
+            <w:r>
+              <w:rPr>
+                <w:sz w:val="20"/>
+                <w:szCs w:val="20"/>
+              </w:rPr>
+              <w:t xml:space="preserve">Pares cuenta/importe</w:t>
+            </w:r>
+          </w:p>
+        </w:tc>
+        <w:tc>
+          <w:tcPr>
+            <w:tcW w:w="2800" w:type="dxa"/>
+            <w:noWrap/>
+          </w:tcPr>
+          <w:p>
+            <w:pPr/>
+            <w:r>
+              <w:rPr>
+                <w:sz w:val="20"/>
+                <w:szCs w:val="20"/>
+              </w:rPr>
+              <w:t xml:space="preserve">Cuenta con guión (ej. 111050-009) + importe; primera = Haber, segunda = Debe, y así.</w:t>
+            </w:r>
+          </w:p>
+        </w:tc>
+      </w:tr>
+    </w:tbl>
+    <w:p/>
+    <w:p>
+      <w:pPr>
+        <w:numPr>
+          <w:ilvl w:val="0"/>
+          <w:numId w:val=""/>
+        </w:numPr>
+      </w:pPr>
+      <w:r>
+        <w:rPr/>
+        <w:t xml:space="preserve">Si el importe de la primera cuenta es 0, se usa el monto total en las (hasta) dos primeras cuentas.</w:t>
+      </w:r>
+    </w:p>
+    <w:p>
+      <w:pPr>
+        <w:numPr>
+          <w:ilvl w:val="0"/>
+          <w:numId w:val=""/>
+        </w:numPr>
+      </w:pPr>
+      <w:r>
+        <w:rPr/>
+        <w:t xml:space="preserve">Filas con error (maestro inexistente, cuenta no hallada, monto 0, empresa no asignada) no se generan; el preview las lista.</w:t>
+      </w:r>
+    </w:p>
+    <w:p>
+      <w:pPr>
+        <w:numPr>
+          <w:ilvl w:val="0"/>
+          <w:numId w:val=""/>
+        </w:numPr>
+      </w:pPr>
+      <w:r>
+        <w:rPr/>
+        <w:t xml:space="preserve">Revise siempre el preview antes de confirmar: la generación escribe en ERP y en Anita.</w:t>
+      </w:r>
+    </w:p>
+    <w:p>
+      <w:pPr>
+        <w:numPr>
+          <w:ilvl w:val="0"/>
+          <w:numId w:val=""/>
+        </w:numPr>
+      </w:pPr>
+      <w:r>
+        <w:rPr/>
+        <w:t xml:space="preserve">Roles típicos con permiso: Impuestos (Enc/Op) y Capital Humano (enc/op/ger/opcont).</w:t>
+      </w:r>
+    </w:p>
+    <w:p/>
+    <w:p>
+      <w:pPr>
+        <w:pStyle w:val="Heading2"/>
+      </w:pPr>
+      <w:bookmarkStart w:id="6" w:name="_Toc6"/>
+      <w:r>
+        <w:t>6. Filtros del listado (detalle)</w:t>
+      </w:r>
+      <w:bookmarkEnd w:id="6"/>
     </w:p>
     <w:p>
       <w:pPr>
@@ -2894,11 +3818,11 @@
       <w:pPr>
         <w:pStyle w:val="Heading2"/>
       </w:pPr>
-      <w:bookmarkStart w:id="6" w:name="_Toc6"/>
-      <w:r>
-        <w:t>6. Consulta de madres, hijas y cuotas</w:t>
-      </w:r>
-      <w:bookmarkEnd w:id="6"/>
+      <w:bookmarkStart w:id="7" w:name="_Toc7"/>
+      <w:r>
+        <w:t>7. Consulta de madres, hijas y cuotas</w:t>
+      </w:r>
+      <w:bookmarkEnd w:id="7"/>
     </w:p>
     <w:p>
       <w:pPr>
@@ -3295,11 +4219,11 @@
       <w:pPr>
         <w:pStyle w:val="Heading2"/>
       </w:pPr>
-      <w:bookmarkStart w:id="7" w:name="_Toc7"/>
-      <w:r>
-        <w:t>7. Alta y edición de una SP</w:t>
-      </w:r>
-      <w:bookmarkEnd w:id="7"/>
+      <w:bookmarkStart w:id="8" w:name="_Toc8"/>
+      <w:r>
+        <w:t>8. Alta y edición de una SP</w:t>
+      </w:r>
+      <w:bookmarkEnd w:id="8"/>
     </w:p>
     <w:p>
       <w:pPr>
@@ -4136,11 +5060,11 @@
       <w:pPr>
         <w:pStyle w:val="Heading2"/>
       </w:pPr>
-      <w:bookmarkStart w:id="8" w:name="_Toc8"/>
-      <w:r>
-        <w:t>8. Plan de cuotas (madre)</w:t>
-      </w:r>
-      <w:bookmarkEnd w:id="8"/>
+      <w:bookmarkStart w:id="9" w:name="_Toc9"/>
+      <w:r>
+        <w:t>9. Plan de cuotas (madre)</w:t>
+      </w:r>
+      <w:bookmarkEnd w:id="9"/>
     </w:p>
     <w:p>
       <w:pPr>
@@ -4280,11 +5204,11 @@
       <w:pPr>
         <w:pStyle w:val="Heading2"/>
       </w:pPr>
-      <w:bookmarkStart w:id="9" w:name="_Toc9"/>
-      <w:r>
-        <w:t>9. Informe de solicitudes de pago</w:t>
-      </w:r>
-      <w:bookmarkEnd w:id="9"/>
+      <w:bookmarkStart w:id="10" w:name="_Toc10"/>
+      <w:r>
+        <w:t>10. Informe de solicitudes de pago</w:t>
+      </w:r>
+      <w:bookmarkEnd w:id="10"/>
     </w:p>
     <w:p>
       <w:pPr>
@@ -5047,11 +5971,11 @@
       <w:pPr>
         <w:pStyle w:val="Heading2"/>
       </w:pPr>
-      <w:bookmarkStart w:id="10" w:name="_Toc10"/>
-      <w:r>
-        <w:t>10. Permisos</w:t>
-      </w:r>
-      <w:bookmarkEnd w:id="10"/>
+      <w:bookmarkStart w:id="11" w:name="_Toc11"/>
+      <w:r>
+        <w:t>11. Permisos</w:t>
+      </w:r>
+      <w:bookmarkEnd w:id="11"/>
     </w:p>
     <w:p>
       <w:pPr>
@@ -5064,6 +5988,19 @@
           <w:szCs w:val="22"/>
         </w:rPr>
         <w:t xml:space="preserve">Si no ve un botón descrito aquí, su rol probablemente no tiene el permiso. Solicítelo al administrador de usuarios.</w:t>
+      </w:r>
+    </w:p>
+    <w:p>
+      <w:pPr>
+        <w:jc w:val="both"/>
+        <w:spacing w:after="120"/>
+      </w:pPr>
+      <w:r>
+        <w:rPr>
+          <w:sz w:val="22"/>
+          <w:szCs w:val="22"/>
+        </w:rPr>
+        <w:t xml:space="preserve">Roles operativos habituales con el CRUD de SP (incluye carga masiva): Impuestos (Enc-impuestos, Op-impuestos) y Capital Humano (enc-Capital Humano, op-Capital Humano, ger-capitalhumano, opcont-capitalhumano), además de administrador.</w:t>
       </w:r>
     </w:p>
     <w:p>
@@ -5210,7 +6147,7 @@
                 <w:sz w:val="20"/>
                 <w:szCs w:val="20"/>
               </w:rPr>
-              <w:t xml:space="preserve">Botón Nuevo registro.</w:t>
+              <w:t xml:space="preserve">Nuevo registro y carga masiva CSV.</w:t>
             </w:r>
           </w:p>
         </w:tc>
@@ -5351,6 +6288,41 @@
                 <w:szCs w:val="20"/>
               </w:rPr>
               <w:t xml:space="preserve">Informe analítico y sus exportaciones.</w:t>
+            </w:r>
+          </w:p>
+        </w:tc>
+      </w:tr>
+      <w:tr>
+        <w:trPr/>
+        <w:tc>
+          <w:tcPr>
+            <w:tcW w:w="2800" w:type="dxa"/>
+            <w:noWrap/>
+          </w:tcPr>
+          <w:p>
+            <w:pPr/>
+            <w:r>
+              <w:rPr>
+                <w:sz w:val="20"/>
+                <w:szCs w:val="20"/>
+              </w:rPr>
+              <w:t xml:space="preserve">listar-todas-solicitud-pago</w:t>
+            </w:r>
+          </w:p>
+        </w:tc>
+        <w:tc>
+          <w:tcPr>
+            <w:tcW w:w="2800" w:type="dxa"/>
+            <w:noWrap/>
+          </w:tcPr>
+          <w:p>
+            <w:pPr/>
+            <w:r>
+              <w:rPr>
+                <w:sz w:val="20"/>
+                <w:szCs w:val="20"/>
+              </w:rPr>
+              <w:t xml:space="preserve">Ver todas las SP sin restringir por centro de costo (Impuestos).</w:t>
             </w:r>
           </w:p>
         </w:tc>
@@ -5361,11 +6333,11 @@
       <w:pPr>
         <w:pStyle w:val="Heading2"/>
       </w:pPr>
-      <w:bookmarkStart w:id="11" w:name="_Toc11"/>
-      <w:r>
-        <w:t>11. Buenas prácticas</w:t>
-      </w:r>
-      <w:bookmarkEnd w:id="11"/>
+      <w:bookmarkStart w:id="12" w:name="_Toc12"/>
+      <w:r>
+        <w:t>12. Buenas prácticas</w:t>
+      </w:r>
+      <w:bookmarkEnd w:id="12"/>
     </w:p>
     <w:p>
       <w:pPr>
@@ -5430,6 +6402,19 @@
           <w:szCs w:val="22"/>
         </w:rPr>
         <w:t xml:space="preserve">En hijas, no intente cargar cuotas: el sistema las omite a propósito. Edite el plan en la madre.</w:t>
+      </w:r>
+    </w:p>
+    <w:p>
+      <w:pPr>
+        <w:jc w:val="both"/>
+        <w:spacing w:after="120"/>
+      </w:pPr>
+      <w:r>
+        <w:rPr>
+          <w:sz w:val="22"/>
+          <w:szCs w:val="22"/>
+        </w:rPr>
+        <w:t xml:space="preserve">En carga masiva: valide el CSV en el preview; no confirme si hay muchas filas en error. Conserve una copia del archivo fuera del ERP.</w:t>
       </w:r>
     </w:p>
     <w:p>
@@ -5466,6 +6451,18 @@
       <w:r>
         <w:rPr/>
         <w:t xml:space="preserve">Documente en Detalle/Observación el vínculo con OC, contrato o legajo cuando aplique.</w:t>
+      </w:r>
+    </w:p>
+    <w:p>
+      <w:pPr>
+        <w:numPr>
+          <w:ilvl w:val="0"/>
+          <w:numId w:val=""/>
+        </w:numPr>
+      </w:pPr>
+      <w:r>
+        <w:rPr/>
+        <w:t xml:space="preserve">Consulte siempre el Centro de ayuda para el procedimiento vigente; el copiloto IA cita este manual.</w:t>
       </w:r>
     </w:p>
     <w:p/>

</xml_diff>